<commit_message>
feat(career): update admin logistics resume facts
</commit_message>
<xml_diff>
--- a/resumes/generated/Rafa_Nascimento_Curriculo_CausaCerta_AnalistaAdmVendas_V2.docx
+++ b/resumes/generated/Rafa_Nascimento_Curriculo_CausaCerta_AnalistaAdmVendas_V2.docx
@@ -4,288 +4,613 @@
   <w:body>
     <w:p>
       <w:pPr>
-        <w:pStyle w:val="Heading1"/>
+        <w:spacing w:before="0" w:after="20"/>
       </w:pPr>
       <w:r>
+        <w:rPr>
+          <w:b/>
+          <w:i w:val="0"/>
+          <w:color w:val="23272F"/>
+          <w:sz w:val="32"/>
+        </w:rPr>
         <w:t>CAIO RAFAEL BARROS DO NASCIMENTO</w:t>
       </w:r>
     </w:p>
     <w:p>
+      <w:pPr>
+        <w:spacing w:before="0" w:after="40"/>
+        <w:pBdr>
+          <w:bottom w:val="single" w:sz="9" w:space="1" w:color="1F5C4E"/>
+        </w:pBdr>
+      </w:pPr>
       <w:r>
-        <w:t>Analista Administrativo de Vendas | Rotinas Administrativas | Contratos e Atendimento</w:t>
-      </w:r>
-    </w:p>
-    <w:p>
-      <w:r>
-        <w:t>Nova Palhoça — Palhoça/SC | (48) 99153-2952 | cr_bn20@hotmail.com | linkedin.com/in/rafael-brasiliae</w:t>
-      </w:r>
-    </w:p>
-    <w:p>
-      <w:r>
-        <w:t>Disponibilidade: 100% home office ou presencial (Grande Florianópolis) | Viagens: disponível quando necessário</w:t>
+        <w:rPr>
+          <w:b/>
+          <w:i w:val="0"/>
+          <w:color w:val="23272F"/>
+          <w:sz w:val="18"/>
+        </w:rPr>
+        <w:t>Analista Administrativo de Vendas  |  Rotinas Administrativas  |  Logística e Suporte Operacional</w:t>
       </w:r>
     </w:p>
     <w:p>
       <w:pPr>
-        <w:pStyle w:val="Heading2"/>
+        <w:spacing w:before="0" w:after="20"/>
       </w:pPr>
       <w:r>
+        <w:rPr>
+          <w:b w:val="0"/>
+          <w:i w:val="0"/>
+          <w:color w:val="5A6270"/>
+          <w:sz w:val="15"/>
+        </w:rPr>
+        <w:t>Nova Palhoça — Palhoça/SC  |  (48) 99153-2952  |  cr_bn20@hotmail.com  |  linkedin.com/in/rafael-brasiliae</w:t>
+      </w:r>
+    </w:p>
+    <w:p>
+      <w:pPr>
+        <w:spacing w:before="80" w:after="20"/>
+        <w:pBdr>
+          <w:bottom w:val="single" w:sz="6" w:space="1" w:color="C9CFD6"/>
+        </w:pBdr>
+      </w:pPr>
+      <w:r>
+        <w:rPr>
+          <w:b/>
+          <w:i w:val="0"/>
+          <w:color w:val="1F5C4E"/>
+          <w:sz w:val="19"/>
+        </w:rPr>
         <w:t>RESUMO PROFISSIONAL</w:t>
       </w:r>
     </w:p>
     <w:p>
+      <w:pPr>
+        <w:spacing w:before="0" w:after="0"/>
+      </w:pPr>
       <w:r>
-        <w:t>Profissional administrativo e comercial com experiência em rotinas administrativas, atendimento ao cliente, vendas B2B e organização de processos. Atuação com conferência e manutenção de contratos, atualização de sistemas e bases operacionais, uso de planilhas, ERP e canais digitais para acompanhar pedidos, documentos, prazos e demandas entre áreas. Perfil comunicativo, organizado, atento a detalhes e alinhado a funções que exigem suporte ao time de vendas, coleta de documentação e acompanhamento do status de contratos.</w:t>
+        <w:rPr>
+          <w:b w:val="0"/>
+          <w:i w:val="0"/>
+          <w:color w:val="23272F"/>
+          <w:sz w:val="17"/>
+        </w:rPr>
+        <w:t>Profissional administrativo e operacional com mais de 5 anos de atuação em rotinas administrativas de escritório, suporte operacional, logística de compras e suprimentos. Experiência com documentos, planilhas, sistemas, contratos, gestão de fretes, Incoterms CIF e FOB, ERP, CRM e licitações eletrônicas, com acompanhamento ponta a ponta do recebimento na fábrica à entrega final. Perfil organizado, atento a detalhes e orientado à consolidação de processos confiáveis.</w:t>
       </w:r>
     </w:p>
     <w:p>
       <w:pPr>
-        <w:pStyle w:val="Heading2"/>
+        <w:spacing w:before="80" w:after="20"/>
+        <w:pBdr>
+          <w:bottom w:val="single" w:sz="6" w:space="1" w:color="C9CFD6"/>
+        </w:pBdr>
       </w:pPr>
       <w:r>
-        <w:t>COMPETÊNCIAS</w:t>
+        <w:rPr>
+          <w:b/>
+          <w:i w:val="0"/>
+          <w:color w:val="1F5C4E"/>
+          <w:sz w:val="19"/>
+        </w:rPr>
+        <w:t>COMPETÊNCIAS-CHAVE</w:t>
       </w:r>
     </w:p>
     <w:p>
       <w:pPr>
-        <w:pStyle w:val="ListBullet"/>
+        <w:spacing w:before="0" w:after="0"/>
+        <w:ind w:left="170"/>
       </w:pPr>
       <w:r>
-        <w:t>Contratos e documentação: conferência de contratos, organização de documentos, acompanhamento de status, requisitos e prazos</w:t>
+        <w:rPr>
+          <w:b w:val="0"/>
+          <w:i w:val="0"/>
+          <w:color w:val="23272F"/>
+          <w:sz w:val="17"/>
+        </w:rPr>
+        <w:t>- Rotinas administrativas e suporte operacional: documentos, planilhas, sistemas, registros, bases e acompanhamento de demandas internas</w:t>
       </w:r>
     </w:p>
     <w:p>
       <w:pPr>
-        <w:pStyle w:val="ListBullet"/>
+        <w:spacing w:before="0" w:after="0"/>
+        <w:ind w:left="170"/>
       </w:pPr>
       <w:r>
-        <w:t>Rotinas administrativas: planilhas, sistemas internos, ERP (Olist/Tiny), bases operacionais e apoio a processos de vendas</w:t>
+        <w:rPr>
+          <w:b w:val="0"/>
+          <w:i w:val="0"/>
+          <w:color w:val="23272F"/>
+          <w:sz w:val="17"/>
+        </w:rPr>
+        <w:t>- Logística de compras e suprimentos: gestão de fretes, Incoterms CIF e FOB e acompanhamento do recebimento na fábrica à entrega final</w:t>
       </w:r>
     </w:p>
     <w:p>
       <w:pPr>
-        <w:pStyle w:val="ListBullet"/>
+        <w:spacing w:before="0" w:after="0"/>
+        <w:ind w:left="170"/>
       </w:pPr>
       <w:r>
-        <w:t>Atendimento ao cliente e comunicação: orientação por WhatsApp, e-mail, telefone e canais digitais, com postura profissional e clareza</w:t>
+        <w:rPr>
+          <w:b w:val="0"/>
+          <w:i w:val="0"/>
+          <w:color w:val="23272F"/>
+          <w:sz w:val="17"/>
+        </w:rPr>
+        <w:t>- Contratos e documentação: conferência, organização, tabelas, condições de transporte, status e prazos</w:t>
       </w:r>
     </w:p>
     <w:p>
       <w:pPr>
-        <w:pStyle w:val="ListBullet"/>
+        <w:spacing w:before="0" w:after="0"/>
+        <w:ind w:left="170"/>
       </w:pPr>
       <w:r>
-        <w:t>Comercial B2B: prospecção, negociação, atendimento a clientes empresariais, retenção e contorno de objeções</w:t>
+        <w:rPr>
+          <w:b w:val="0"/>
+          <w:i w:val="0"/>
+          <w:color w:val="23272F"/>
+          <w:sz w:val="17"/>
+        </w:rPr>
+        <w:t>- Sistemas: LINVIX (Tecmater Master), Tiny/Olist, RD Station, Loja Integrada, WordPress/WooCommerce e e-mail marketing</w:t>
       </w:r>
     </w:p>
     <w:p>
       <w:pPr>
-        <w:pStyle w:val="ListBullet"/>
+        <w:spacing w:before="0" w:after="0"/>
+        <w:ind w:left="170"/>
       </w:pPr>
       <w:r>
-        <w:t>Organização e processos: digitalização de rotinas, padronização de atendimento, acompanhamento de demandas simultâneas e treinamento de colegas</w:t>
+        <w:rPr>
+          <w:b w:val="0"/>
+          <w:i w:val="0"/>
+          <w:color w:val="23272F"/>
+          <w:sz w:val="17"/>
+        </w:rPr>
+        <w:t>- Licitações eletrônicas e pregões: participação em nome da empresa, negociação com fornecedores e acompanhamento dos processos</w:t>
       </w:r>
     </w:p>
     <w:p>
       <w:pPr>
-        <w:pStyle w:val="Heading2"/>
+        <w:spacing w:before="80" w:after="20"/>
+        <w:pBdr>
+          <w:bottom w:val="single" w:sz="6" w:space="1" w:color="C9CFD6"/>
+        </w:pBdr>
       </w:pPr>
       <w:r>
+        <w:rPr>
+          <w:b/>
+          <w:i w:val="0"/>
+          <w:color w:val="1F5C4E"/>
+          <w:sz w:val="19"/>
+        </w:rPr>
         <w:t>EXPERIÊNCIA PROFISSIONAL</w:t>
       </w:r>
     </w:p>
     <w:p>
       <w:pPr>
-        <w:pStyle w:val="Heading3"/>
+        <w:spacing w:before="60" w:after="0"/>
       </w:pPr>
       <w:r>
-        <w:t>LOJACOND (Store / Equipamentos) — Palhoça/SC | Mar/2021 – Abr/2026</w:t>
+        <w:rPr>
+          <w:b/>
+          <w:i w:val="0"/>
+          <w:color w:val="23272F"/>
+          <w:sz w:val="17"/>
+        </w:rPr>
+        <w:t>LOJACOND EQUIPAMENTOS PARA CONDOMÍNIOS — Palhoça/SC  |  Mar/2021 – Abr/2026</w:t>
       </w:r>
     </w:p>
     <w:p>
       <w:pPr>
-        <w:pStyle w:val="Heading3"/>
+        <w:spacing w:before="0" w:after="0"/>
       </w:pPr>
       <w:r>
-        <w:t>Gestor de E-commerce e Operações Digitais | Dez/2022 – Abr/2026</w:t>
+        <w:rPr>
+          <w:b/>
+          <w:i/>
+          <w:color w:val="23272F"/>
+          <w:sz w:val="17"/>
+        </w:rPr>
+        <w:t>Gestor de E-commerce e Operações Digitais  |  Out/2024 – Abr/2026</w:t>
       </w:r>
     </w:p>
     <w:p>
       <w:pPr>
-        <w:pStyle w:val="ListBullet"/>
+        <w:spacing w:before="0" w:after="0"/>
+        <w:ind w:left="170"/>
       </w:pPr>
       <w:r>
-        <w:t>Gestão da operação comercial e administrativa de e-commerce e marketplaces, acompanhando vendas, pedidos, estoque, preços, contratos com transportadoras e indicadores de desempenho</w:t>
+        <w:rPr>
+          <w:b w:val="0"/>
+          <w:i w:val="0"/>
+          <w:color w:val="23272F"/>
+          <w:sz w:val="17"/>
+        </w:rPr>
+        <w:t>- Evolução interna da função administrativa e operacional para a gestão integrada de e-commerce, loja online e marketplaces</w:t>
       </w:r>
     </w:p>
     <w:p>
       <w:pPr>
-        <w:pStyle w:val="ListBullet"/>
+        <w:spacing w:before="0" w:after="0"/>
+        <w:ind w:left="170"/>
       </w:pPr>
       <w:r>
-        <w:t>Administração de aproximadamente 2 mil SKUs e base de 7 mil clientes, garantindo organização, atualização e consistência das informações comerciais e operacionais</w:t>
+        <w:rPr>
+          <w:b w:val="0"/>
+          <w:i w:val="0"/>
+          <w:color w:val="23272F"/>
+          <w:sz w:val="17"/>
+        </w:rPr>
+        <w:t>- Gestão de vendas, catálogo, pedidos, estoque, preços, anúncios e indicadores; administração de aproximadamente 2 mil SKUs e base de 7 mil clientes</w:t>
       </w:r>
     </w:p>
     <w:p>
       <w:pPr>
-        <w:pStyle w:val="ListBullet"/>
+        <w:spacing w:before="0" w:after="0"/>
+        <w:ind w:left="170"/>
       </w:pPr>
       <w:r>
-        <w:t>Integração entre ERP (Olist/Tiny), pagamentos, frete, estoque e canais de atendimento, acompanhando o fluxo do pedido da venda ao pós-venda</w:t>
+        <w:rPr>
+          <w:b w:val="0"/>
+          <w:i w:val="0"/>
+          <w:color w:val="23272F"/>
+          <w:sz w:val="17"/>
+        </w:rPr>
+        <w:t>- Experiência de 1 ano na Loja Integrada, liderando a migração de site catálogo/orçamento para e-commerce transacional, seguida de nova migração técnica para WordPress com WooCommerce</w:t>
       </w:r>
     </w:p>
     <w:p>
       <w:pPr>
-        <w:pStyle w:val="ListBullet"/>
+        <w:spacing w:before="0" w:after="0"/>
+        <w:ind w:left="170"/>
       </w:pPr>
       <w:r>
-        <w:t>Resolução de problemas e melhoria contínua da operação, priorizando processos confiáveis, rastreáveis e orientados por dados</w:t>
+        <w:rPr>
+          <w:b w:val="0"/>
+          <w:i w:val="0"/>
+          <w:color w:val="23272F"/>
+          <w:sz w:val="17"/>
+        </w:rPr>
+        <w:t>- Integração entre e-commerce, ERP (Olist/Tiny), pagamentos, frete, estoque e canais de atendimento; acompanhamento do fluxo completo do pedido</w:t>
       </w:r>
     </w:p>
     <w:p>
       <w:pPr>
-        <w:pStyle w:val="Heading3"/>
+        <w:spacing w:before="0" w:after="0"/>
+        <w:ind w:left="170"/>
       </w:pPr>
       <w:r>
-        <w:t>Assistente Administrativo e Comercial | Mar/2021 – Dez/2022</w:t>
+        <w:rPr>
+          <w:b w:val="0"/>
+          <w:i w:val="0"/>
+          <w:color w:val="23272F"/>
+          <w:sz w:val="17"/>
+        </w:rPr>
+        <w:t>- Gestão de CRM e e-mail marketing; gestão da loja oficial no Mercado Livre e melhoria contínua da operação</w:t>
       </w:r>
     </w:p>
     <w:p>
       <w:pPr>
-        <w:pStyle w:val="ListBullet"/>
+        <w:spacing w:before="0" w:after="0"/>
       </w:pPr>
       <w:r>
-        <w:t>Ingresso por estágio durante a graduação em Administração e efetivação CLT após 3 meses, com atuação direta junto à gerência e direção</w:t>
+        <w:rPr>
+          <w:b/>
+          <w:i/>
+          <w:color w:val="23272F"/>
+          <w:sz w:val="17"/>
+        </w:rPr>
+        <w:t>Assistente Administrativo e Comercial  |  Mar/2021 – Out/2024</w:t>
       </w:r>
     </w:p>
     <w:p>
       <w:pPr>
-        <w:pStyle w:val="ListBullet"/>
+        <w:spacing w:before="0" w:after="0"/>
+        <w:ind w:left="170"/>
       </w:pPr>
       <w:r>
-        <w:t>Estruturação e digitalização de processos de atendimento, orçamento e vendas B2B, integrando WhatsApp, e-mail, telefone, site e canais digitais</w:t>
+        <w:rPr>
+          <w:b w:val="0"/>
+          <w:i w:val="0"/>
+          <w:color w:val="23272F"/>
+          <w:sz w:val="17"/>
+        </w:rPr>
+        <w:t>- Ingresso como estagiário durante a graduação em Administração, efetivado em CLT após 3 meses, com crescimento interno e ampliação contínua de responsabilidades</w:t>
       </w:r>
     </w:p>
     <w:p>
       <w:pPr>
-        <w:pStyle w:val="ListBullet"/>
+        <w:spacing w:before="0" w:after="0"/>
+        <w:ind w:left="170"/>
       </w:pPr>
       <w:r>
-        <w:t>Organização e atualização de sistemas e bases operacionais, incluindo migração de processos para Olist/Tiny em operação com cerca de 7 mil clientes e 2 mil SKUs</w:t>
+        <w:rPr>
+          <w:b w:val="0"/>
+          <w:i w:val="0"/>
+          <w:color w:val="23272F"/>
+          <w:sz w:val="17"/>
+        </w:rPr>
+        <w:t>- Execução e organização de rotinas administrativas de escritório e suporte operacional: documentos, planilhas, sistemas, registros, bases e acompanhamento de demandas internas</w:t>
       </w:r>
     </w:p>
     <w:p>
       <w:pPr>
-        <w:pStyle w:val="ListBullet"/>
+        <w:spacing w:before="0" w:after="0"/>
+        <w:ind w:left="170"/>
       </w:pPr>
       <w:r>
-        <w:t>Negociação e manutenção de contratos, tabelas e condições comerciais com transportadoras, apoiando uma operação logística com cobertura nacional</w:t>
+        <w:rPr>
+          <w:b w:val="0"/>
+          <w:i w:val="0"/>
+          <w:color w:val="23272F"/>
+          <w:sz w:val="17"/>
+        </w:rPr>
+        <w:t>- Atuação técnica em logística de compras e suprimentos, gestão de fretes e Incoterms CIF e FOB, com acompanhamento ponta a ponta do recebimento na fábrica à entrega final</w:t>
       </w:r>
     </w:p>
     <w:p>
       <w:pPr>
-        <w:pStyle w:val="ListBullet"/>
+        <w:spacing w:before="0" w:after="0"/>
+        <w:ind w:left="170"/>
       </w:pPr>
       <w:r>
-        <w:t>Prospecção, negociação e desenvolvimento comercial B2B com condomínios, empresas privadas e órgãos públicos, incluindo negociações de até R$ 70 mil</w:t>
+        <w:rPr>
+          <w:b w:val="0"/>
+          <w:i w:val="0"/>
+          <w:color w:val="23272F"/>
+          <w:sz w:val="17"/>
+        </w:rPr>
+        <w:t>- Uso do ERP LINVIX, da Tecmater Master, durante 3 anos, com posterior migração de processos para o Tiny, da Olist; uso do CRM da RD Station</w:t>
       </w:r>
     </w:p>
     <w:p>
       <w:pPr>
-        <w:pStyle w:val="Heading3"/>
+        <w:spacing w:before="0" w:after="0"/>
+        <w:ind w:left="170"/>
       </w:pPr>
       <w:r>
-        <w:t>FLEX CONTACT CENTER — Florianópolis/SC | Fev/2018 – Dez/2020</w:t>
+        <w:rPr>
+          <w:b w:val="0"/>
+          <w:i w:val="0"/>
+          <w:color w:val="23272F"/>
+          <w:sz w:val="17"/>
+        </w:rPr>
+        <w:t>- No último ano da atuação na empresa, participação em licitações em nome da empresa e domínio dos processos de licitações eletrônicas, incluindo pregões vencidos por meio da negociação com a lista de fornecedores</w:t>
       </w:r>
     </w:p>
     <w:p>
       <w:pPr>
-        <w:pStyle w:val="ListBullet"/>
+        <w:spacing w:before="0" w:after="0"/>
+        <w:ind w:left="170"/>
       </w:pPr>
       <w:r>
-        <w:t>Agente de Retenção B2B: atendimento a clientes empresariais, orientação, negociação orientada por metas, escuta ativa e contorno de objeções (pacote Claro NET)</w:t>
+        <w:rPr>
+          <w:b w:val="0"/>
+          <w:i w:val="0"/>
+          <w:color w:val="23272F"/>
+          <w:sz w:val="17"/>
+        </w:rPr>
+        <w:t>- Negociação e manutenção de contratos, tabelas e condições com transportadoras e parceiros; apoio pontual a atendimento, orçamento e demandas comerciais</w:t>
       </w:r>
     </w:p>
     <w:p>
       <w:pPr>
-        <w:pStyle w:val="Heading3"/>
+        <w:spacing w:before="60" w:after="0"/>
       </w:pPr>
       <w:r>
-        <w:t>MG VIDROS — AUTO GLASS | 2013 – 2014</w:t>
+        <w:rPr>
+          <w:b/>
+          <w:i w:val="0"/>
+          <w:color w:val="23272F"/>
+          <w:sz w:val="17"/>
+        </w:rPr>
+        <w:t>FLEX CONTACT CENTER — Florianópolis/SC  |  Fev/2018 – Dez/2020</w:t>
       </w:r>
     </w:p>
     <w:p>
       <w:pPr>
-        <w:pStyle w:val="ListBullet"/>
+        <w:spacing w:before="0" w:after="0"/>
+        <w:ind w:left="170"/>
       </w:pPr>
       <w:r>
-        <w:t>Auxiliar de Vendedor Técnico / Jovem Aprendiz: atendimento, elaboração de orçamentos e apoio à venda técnica no setor automotivo</w:t>
+        <w:rPr>
+          <w:b w:val="0"/>
+          <w:i w:val="0"/>
+          <w:color w:val="23272F"/>
+          <w:sz w:val="17"/>
+        </w:rPr>
+        <w:t>- Agente de Retenção B2B: atendimento a clientes empresariais, orientação e negociação orientada por metas, escuta ativa e contorno de objeções (pacote Claro NET)</w:t>
       </w:r>
     </w:p>
     <w:p>
       <w:pPr>
-        <w:pStyle w:val="Heading2"/>
+        <w:spacing w:before="60" w:after="0"/>
       </w:pPr>
       <w:r>
+        <w:rPr>
+          <w:b/>
+          <w:i w:val="0"/>
+          <w:color w:val="23272F"/>
+          <w:sz w:val="17"/>
+        </w:rPr>
+        <w:t>MG VIDROS — AUTO GLASS  |  03/2013 – 09/2015</w:t>
+      </w:r>
+    </w:p>
+    <w:p>
+      <w:pPr>
+        <w:spacing w:before="0" w:after="0"/>
+      </w:pPr>
+      <w:r>
+        <w:rPr>
+          <w:b/>
+          <w:i/>
+          <w:color w:val="23272F"/>
+          <w:sz w:val="17"/>
+        </w:rPr>
+        <w:t>Jovem Aprendiz / Auxiliar de Vendedor Técnico</w:t>
+      </w:r>
+    </w:p>
+    <w:p>
+      <w:pPr>
+        <w:spacing w:before="0" w:after="0"/>
+        <w:ind w:left="170"/>
+      </w:pPr>
+      <w:r>
+        <w:rPr>
+          <w:b w:val="0"/>
+          <w:i w:val="0"/>
+          <w:color w:val="23272F"/>
+          <w:sz w:val="17"/>
+        </w:rPr>
+        <w:t>- Contrato de Jovem Aprendiz com formação profissionalizante de Assistente de Vendas pelo ISBET; atendimento, elaboração de orçamentos e apoio à venda técnica no setor automotivo</w:t>
+      </w:r>
+    </w:p>
+    <w:p>
+      <w:pPr>
+        <w:spacing w:before="80" w:after="20"/>
+        <w:pBdr>
+          <w:bottom w:val="single" w:sz="6" w:space="1" w:color="C9CFD6"/>
+        </w:pBdr>
+      </w:pPr>
+      <w:r>
+        <w:rPr>
+          <w:b/>
+          <w:i w:val="0"/>
+          <w:color w:val="1F5C4E"/>
+          <w:sz w:val="19"/>
+        </w:rPr>
         <w:t>FORMAÇÃO</w:t>
       </w:r>
     </w:p>
     <w:p>
       <w:pPr>
-        <w:pStyle w:val="ListBullet"/>
+        <w:spacing w:before="0" w:after="0"/>
+        <w:ind w:left="170"/>
       </w:pPr>
       <w:r>
-        <w:t>Administração — 3 anos cursados</w:t>
+        <w:rPr>
+          <w:b w:val="0"/>
+          <w:i w:val="0"/>
+          <w:color w:val="23272F"/>
+          <w:sz w:val="17"/>
+        </w:rPr>
+        <w:t>- Administração — Faculdade FATENP — Nova Palhoça (Transferido)</w:t>
       </w:r>
     </w:p>
     <w:p>
       <w:pPr>
-        <w:pStyle w:val="ListBullet"/>
+        <w:spacing w:before="0" w:after="0"/>
+        <w:ind w:left="170"/>
       </w:pPr>
       <w:r>
-        <w:t>Análise e Desenvolvimento de Sistemas — UNISUL (cursando, conclusão prevista 2027)</w:t>
+        <w:rPr>
+          <w:b w:val="0"/>
+          <w:i w:val="0"/>
+          <w:color w:val="23272F"/>
+          <w:sz w:val="17"/>
+        </w:rPr>
+        <w:t>- Análise e Desenvolvimento de Sistemas (ADS) — UNISUL — Pedra Branca (cursando, conclusão prevista 2027)</w:t>
       </w:r>
     </w:p>
     <w:p>
       <w:pPr>
-        <w:pStyle w:val="ListBullet"/>
+        <w:spacing w:before="0" w:after="0"/>
+        <w:ind w:left="170"/>
       </w:pPr>
       <w:r>
-        <w:t>Assistente Administrativo — S.O.S Educação Profissional (2012, 18 meses)</w:t>
+        <w:rPr>
+          <w:b w:val="0"/>
+          <w:i w:val="0"/>
+          <w:color w:val="23272F"/>
+          <w:sz w:val="17"/>
+        </w:rPr>
+        <w:t>- Assistente Administrativo — S.O.S Educação Profissional (2012, 18 meses)</w:t>
       </w:r>
     </w:p>
     <w:p>
       <w:pPr>
-        <w:pStyle w:val="ListBullet"/>
+        <w:spacing w:before="80" w:after="20"/>
+        <w:pBdr>
+          <w:bottom w:val="single" w:sz="6" w:space="1" w:color="C9CFD6"/>
+        </w:pBdr>
       </w:pPr>
       <w:r>
-        <w:t>Ensino Médio — completo</w:t>
-      </w:r>
-    </w:p>
-    <w:p>
-      <w:pPr>
-        <w:pStyle w:val="Heading2"/>
-      </w:pPr>
-      <w:r>
+        <w:rPr>
+          <w:b/>
+          <w:i w:val="0"/>
+          <w:color w:val="1F5C4E"/>
+          <w:sz w:val="19"/>
+        </w:rPr>
         <w:t>IDIOMAS</w:t>
       </w:r>
     </w:p>
     <w:p>
       <w:pPr>
-        <w:pStyle w:val="ListBullet"/>
+        <w:spacing w:before="0" w:after="0"/>
+        <w:ind w:left="170"/>
       </w:pPr>
       <w:r>
-        <w:t>Português nativo | Inglês avançado</w:t>
+        <w:rPr>
+          <w:b w:val="0"/>
+          <w:i w:val="0"/>
+          <w:color w:val="23272F"/>
+          <w:sz w:val="17"/>
+        </w:rPr>
+        <w:t>- Português nativo  |  Inglês avançado</w:t>
       </w:r>
     </w:p>
     <w:sectPr>
-      <w:pgSz w:w="12240" w:h="15840"/>
-      <w:pgMar w:top="1440" w:right="1800" w:bottom="1440" w:left="1800" w:header="720" w:footer="720" w:gutter="0"/>
+      <w:footerReference w:type="default" r:id="rId9"/>
+      <w:pgSz w:w="11906" w:h="16838"/>
+      <w:pgMar w:top="567" w:right="680" w:bottom="567" w:left="680" w:header="720" w:footer="720" w:gutter="0"/>
       <w:cols w:space="720"/>
       <w:docGrid w:linePitch="360"/>
     </w:sectPr>
   </w:body>
 </w:document>
+</file>
+
+<file path=word/footer1.xml><?xml version="1.0" encoding="utf-8"?>
+<w:ftr xmlns:m="http://schemas.openxmlformats.org/officeDocument/2006/math" xmlns:mc="http://schemas.openxmlformats.org/markup-compatibility/2006" xmlns:mo="http://schemas.microsoft.com/office/mac/office/2008/main" xmlns:mv="urn:schemas-microsoft-com:mac:vml" xmlns:o="urn:schemas-microsoft-com:office:office" xmlns:r="http://schemas.openxmlformats.org/officeDocument/2006/relationships" xmlns:v="urn:schemas-microsoft-com:vml" xmlns:w10="urn:schemas-microsoft-com:office:word" xmlns:w14="http://schemas.microsoft.com/office/word/2010/wordml" xmlns:w="http://schemas.openxmlformats.org/wordprocessingml/2006/main" xmlns:wne="http://schemas.microsoft.com/office/word/2006/wordml" xmlns:wp14="http://schemas.microsoft.com/office/word/2010/wordprocessingDrawing" xmlns:wp="http://schemas.openxmlformats.org/drawingml/2006/wordprocessingDrawing" xmlns:wpc="http://schemas.microsoft.com/office/word/2010/wordprocessingCanvas" xmlns:wpg="http://schemas.microsoft.com/office/word/2010/wordprocessingGroup" xmlns:wpi="http://schemas.microsoft.com/office/word/2010/wordprocessingInk" xmlns:wps="http://schemas.microsoft.com/office/word/2010/wordprocessingShape" mc:Ignorable="w14 wp14">
+  <w:p>
+    <w:pPr>
+      <w:pStyle w:val="Footer"/>
+      <w:jc w:val="center"/>
+    </w:pPr>
+    <w:r/>
+    <w:r>
+      <w:rPr>
+        <w:color w:val="5A6270"/>
+        <w:sz w:val="13"/>
+      </w:rPr>
+    </w:r>
+    <w:r>
+      <w:rPr>
+        <w:color w:val="5A6270"/>
+        <w:sz w:val="13"/>
+      </w:rPr>
+      <w:t xml:space="preserve">Página </w:t>
+    </w:r>
+    <w:r>
+      <w:fldChar w:fldCharType="begin"/>
+      <w:instrText xml:space="preserve">PAGE</w:instrText>
+      <w:fldChar w:fldCharType="end"/>
+    </w:r>
+    <w:r>
+      <w:rPr>
+        <w:color w:val="5A6270"/>
+        <w:sz w:val="13"/>
+      </w:rPr>
+      <w:t xml:space="preserve"> de </w:t>
+    </w:r>
+    <w:r>
+      <w:fldChar w:fldCharType="begin"/>
+      <w:instrText xml:space="preserve">NUMPAGES</w:instrText>
+      <w:fldChar w:fldCharType="end"/>
+    </w:r>
+  </w:p>
+</w:ftr>
 </file>
 
 <file path=word/numbering.xml><?xml version="1.0" encoding="utf-8"?>
@@ -651,6 +976,15 @@
     <w:name w:val="Normal"/>
     <w:qFormat/>
     <w:rsid w:val="00FC693F"/>
+    <w:pPr>
+      <w:widowControl/>
+      <w:spacing w:after="0"/>
+    </w:pPr>
+    <w:rPr>
+      <w:rFonts w:ascii="Calibri" w:hAnsi="Calibri"/>
+      <w:color w:val="23272F"/>
+      <w:sz w:val="17"/>
+    </w:rPr>
   </w:style>
   <w:style w:type="paragraph" w:styleId="Header">
     <w:name w:val="header"/>

</xml_diff>